<commit_message>
Doc LoRa, NoeudChauffageSdb en USB 5 V, carte « Lumière cave » sur l'Accueil HA
- Doc/LoRa.md (+ .docx) : bandes de fréquences possibles en Europe,
  avantages et inconvénients, choix 868,1 MHz SF7, mesures RSSI / SNR
  de ThRemise et ThCave, pistes si la portée manque
- NoeudChauffageSdb : alimentation par bloc USB 5 V sur le bornier J1,
  U1 (R-78E) non monté et remplacé par un pont, R3 = 18 Ω ; circuit
  imprimé inchangé (fiche, liste des composants, fiche boîtier + .docx)
- HA : carte « Lumière cave » dans la section Alertes de la vue Accueil,
  état mesuré par ThCave (sensor.jncave_etat : Jour = Allumée en jaune,
  Nuit = Éteinte en bleu) ; vue-accueil.yaml, tableau-accueil-complet.yaml
  (éditeur de configuration brute), export .storage du 30/10, LISEZMOI

Co-Authored-By: Claude Opus 5.5 <noreply@anthropic.com>
</commit_message>
<xml_diff>
--- a/Capteur/boitier/NoeudChauffageSdb/Boîtier NoeudChauffageSdb.docx
+++ b/Capteur/boitier/NoeudChauffageSdb/Boîtier NoeudChauffageSdb.docx
@@ -139,8 +139,8 @@
         </w:tblBorders>
       </w:tblPr>
       <w:tblGrid>
-        <w:gridCol w:w="1634"/>
-        <w:gridCol w:w="8004"/>
+        <w:gridCol w:w="2372"/>
+        <w:gridCol w:w="7266"/>
       </w:tblGrid>
       <w:tr>
         <w:trPr>
@@ -148,7 +148,7 @@
         </w:trPr>
         <w:tc>
           <w:tcPr>
-            <w:tcW w:type="dxa" w:w="1634"/>
+            <w:tcW w:type="dxa" w:w="2372"/>
             <w:tcBorders>
               <w:top w:val="single" w:color="999999" w:sz="4"/>
               <w:left w:val="single" w:color="999999" w:sz="4"/>
@@ -175,7 +175,7 @@
         </w:tc>
         <w:tc>
           <w:tcPr>
-            <w:tcW w:type="dxa" w:w="8004"/>
+            <w:tcW w:type="dxa" w:w="7266"/>
             <w:tcBorders>
               <w:top w:val="single" w:color="999999" w:sz="4"/>
               <w:left w:val="single" w:color="999999" w:sz="4"/>
@@ -207,7 +207,7 @@
         </w:trPr>
         <w:tc>
           <w:tcPr>
-            <w:tcW w:type="dxa" w:w="1634"/>
+            <w:tcW w:type="dxa" w:w="2372"/>
             <w:tcBorders>
               <w:top w:val="single" w:color="999999" w:sz="4"/>
               <w:left w:val="single" w:color="999999" w:sz="4"/>
@@ -229,7 +229,7 @@
         </w:tc>
         <w:tc>
           <w:tcPr>
-            <w:tcW w:type="dxa" w:w="8004"/>
+            <w:tcW w:type="dxa" w:w="7266"/>
             <w:tcBorders>
               <w:top w:val="single" w:color="999999" w:sz="4"/>
               <w:left w:val="single" w:color="999999" w:sz="4"/>
@@ -266,7 +266,7 @@
         </w:trPr>
         <w:tc>
           <w:tcPr>
-            <w:tcW w:type="dxa" w:w="1634"/>
+            <w:tcW w:type="dxa" w:w="2372"/>
             <w:tcBorders>
               <w:top w:val="single" w:color="999999" w:sz="4"/>
               <w:left w:val="single" w:color="999999" w:sz="4"/>
@@ -288,7 +288,7 @@
         </w:tc>
         <w:tc>
           <w:tcPr>
-            <w:tcW w:type="dxa" w:w="8004"/>
+            <w:tcW w:type="dxa" w:w="7266"/>
             <w:tcBorders>
               <w:top w:val="single" w:color="999999" w:sz="4"/>
               <w:left w:val="single" w:color="999999" w:sz="4"/>
@@ -315,7 +315,7 @@
         </w:trPr>
         <w:tc>
           <w:tcPr>
-            <w:tcW w:type="dxa" w:w="1634"/>
+            <w:tcW w:type="dxa" w:w="2372"/>
             <w:tcBorders>
               <w:top w:val="single" w:color="999999" w:sz="4"/>
               <w:left w:val="single" w:color="999999" w:sz="4"/>
@@ -337,7 +337,7 @@
         </w:tc>
         <w:tc>
           <w:tcPr>
-            <w:tcW w:type="dxa" w:w="8004"/>
+            <w:tcW w:type="dxa" w:w="7266"/>
             <w:tcBorders>
               <w:top w:val="single" w:color="999999" w:sz="4"/>
               <w:left w:val="single" w:color="999999" w:sz="4"/>
@@ -364,29 +364,29 @@
         </w:trPr>
         <w:tc>
           <w:tcPr>
-            <w:tcW w:type="dxa" w:w="1634"/>
-            <w:tcBorders>
-              <w:top w:val="single" w:color="999999" w:sz="4"/>
-              <w:left w:val="single" w:color="999999" w:sz="4"/>
-              <w:bottom w:val="single" w:color="999999" w:sz="4"/>
-              <w:right w:val="single" w:color="999999" w:sz="4"/>
-            </w:tcBorders>
-            <w:tcMar>
-              <w:top w:type="dxa" w:w="60"/>
-              <w:left w:type="dxa" w:w="100"/>
-              <w:bottom w:type="dxa" w:w="60"/>
-              <w:right w:type="dxa" w:w="100"/>
-            </w:tcMar>
-          </w:tcPr>
-          <w:p>
-            <w:r>
-              <w:t xml:space="preserve">Câble 12 V</w:t>
-            </w:r>
-          </w:p>
-        </w:tc>
-        <w:tc>
-          <w:tcPr>
-            <w:tcW w:type="dxa" w:w="8004"/>
+            <w:tcW w:type="dxa" w:w="2372"/>
+            <w:tcBorders>
+              <w:top w:val="single" w:color="999999" w:sz="4"/>
+              <w:left w:val="single" w:color="999999" w:sz="4"/>
+              <w:bottom w:val="single" w:color="999999" w:sz="4"/>
+              <w:right w:val="single" w:color="999999" w:sz="4"/>
+            </w:tcBorders>
+            <w:tcMar>
+              <w:top w:type="dxa" w:w="60"/>
+              <w:left w:type="dxa" w:w="100"/>
+              <w:bottom w:type="dxa" w:w="60"/>
+              <w:right w:type="dxa" w:w="100"/>
+            </w:tcMar>
+          </w:tcPr>
+          <w:p>
+            <w:r>
+              <w:t xml:space="preserve">Câble USB 5 V (12 V à l'origine)</w:t>
+            </w:r>
+          </w:p>
+        </w:tc>
+        <w:tc>
+          <w:tcPr>
+            <w:tcW w:type="dxa" w:w="7266"/>
             <w:tcBorders>
               <w:top w:val="single" w:color="999999" w:sz="4"/>
               <w:left w:val="single" w:color="999999" w:sz="4"/>
@@ -413,7 +413,7 @@
         </w:trPr>
         <w:tc>
           <w:tcPr>
-            <w:tcW w:type="dxa" w:w="1634"/>
+            <w:tcW w:type="dxa" w:w="2372"/>
             <w:tcBorders>
               <w:top w:val="single" w:color="999999" w:sz="4"/>
               <w:left w:val="single" w:color="999999" w:sz="4"/>
@@ -435,7 +435,7 @@
         </w:tc>
         <w:tc>
           <w:tcPr>
-            <w:tcW w:type="dxa" w:w="8004"/>
+            <w:tcW w:type="dxa" w:w="7266"/>
             <w:tcBorders>
               <w:top w:val="single" w:color="999999" w:sz="4"/>
               <w:left w:val="single" w:color="999999" w:sz="4"/>
@@ -469,7 +469,7 @@
         </w:trPr>
         <w:tc>
           <w:tcPr>
-            <w:tcW w:type="dxa" w:w="1634"/>
+            <w:tcW w:type="dxa" w:w="2372"/>
             <w:tcBorders>
               <w:top w:val="single" w:color="999999" w:sz="4"/>
               <w:left w:val="single" w:color="999999" w:sz="4"/>
@@ -491,7 +491,7 @@
         </w:tc>
         <w:tc>
           <w:tcPr>
-            <w:tcW w:type="dxa" w:w="8004"/>
+            <w:tcW w:type="dxa" w:w="7266"/>
             <w:tcBorders>
               <w:top w:val="single" w:color="999999" w:sz="4"/>
               <w:left w:val="single" w:color="999999" w:sz="4"/>
@@ -518,7 +518,7 @@
         </w:trPr>
         <w:tc>
           <w:tcPr>
-            <w:tcW w:type="dxa" w:w="1634"/>
+            <w:tcW w:type="dxa" w:w="2372"/>
             <w:tcBorders>
               <w:top w:val="single" w:color="999999" w:sz="4"/>
               <w:left w:val="single" w:color="999999" w:sz="4"/>
@@ -540,7 +540,7 @@
         </w:tc>
         <w:tc>
           <w:tcPr>
-            <w:tcW w:type="dxa" w:w="8004"/>
+            <w:tcW w:type="dxa" w:w="7266"/>
             <w:tcBorders>
               <w:top w:val="single" w:color="999999" w:sz="4"/>
               <w:left w:val="single" w:color="999999" w:sz="4"/>
@@ -567,7 +567,7 @@
         </w:trPr>
         <w:tc>
           <w:tcPr>
-            <w:tcW w:type="dxa" w:w="1634"/>
+            <w:tcW w:type="dxa" w:w="2372"/>
             <w:tcBorders>
               <w:top w:val="single" w:color="999999" w:sz="4"/>
               <w:left w:val="single" w:color="999999" w:sz="4"/>
@@ -589,7 +589,7 @@
         </w:tc>
         <w:tc>
           <w:tcPr>
-            <w:tcW w:type="dxa" w:w="8004"/>
+            <w:tcW w:type="dxa" w:w="7266"/>
             <w:tcBorders>
               <w:top w:val="single" w:color="999999" w:sz="4"/>
               <w:left w:val="single" w:color="999999" w:sz="4"/>
@@ -616,7 +616,7 @@
         </w:trPr>
         <w:tc>
           <w:tcPr>
-            <w:tcW w:type="dxa" w:w="1634"/>
+            <w:tcW w:type="dxa" w:w="2372"/>
             <w:tcBorders>
               <w:top w:val="single" w:color="999999" w:sz="4"/>
               <w:left w:val="single" w:color="999999" w:sz="4"/>
@@ -638,7 +638,7 @@
         </w:tc>
         <w:tc>
           <w:tcPr>
-            <w:tcW w:type="dxa" w:w="8004"/>
+            <w:tcW w:type="dxa" w:w="7266"/>
             <w:tcBorders>
               <w:top w:val="single" w:color="999999" w:sz="4"/>
               <w:left w:val="single" w:color="999999" w:sz="4"/>
@@ -987,7 +987,7 @@
           <w:sz w:val="17"/>
           <w:szCs w:val="17"/>
         </w:rPr>
-        <w:t xml:space="preserve">  │                                         [pont]   ╞═ câble 12 V</w:t>
+        <w:t xml:space="preserve">  │                                         [pont]   ╞═ câble 5 V</w:t>
       </w:r>
     </w:p>
     <w:p>
@@ -1019,7 +1019,7 @@
           <w:sz w:val="17"/>
           <w:szCs w:val="17"/>
         </w:rPr>
-        <w:t xml:space="preserve">  │ │          J5 micro   J6 LED IR      J1 12 V   │ │</w:t>
+        <w:t xml:space="preserve">  │ │          J5 micro   J6 LED IR      J1 5 V    │ │</w:t>
       </w:r>
     </w:p>
     <w:p>
@@ -1261,7 +1261,7 @@
         </w:numPr>
       </w:pPr>
       <w:r>
-        <w:t xml:space="preserve">Bord de la carte à 1 mm des parois gauche et droite, à 4 mm de la paroi basse (antenne) et à 10 mm de la paroi haute (fiches JST, câble 12 V).</w:t>
+        <w:t xml:space="preserve">Bord de la carte à 1 mm des parois gauche et droite, à 4 mm de la paroi basse (antenne) et à 10 mm de la paroi haute (fiches JST, câble 5 V).</w:t>
       </w:r>
     </w:p>
     <w:p>
@@ -1301,7 +1301,7 @@
         <w:keepNext/>
       </w:pPr>
       <w:r>
-        <w:t xml:space="preserve">3.3 Câble 12 V (paroi droite)</w:t>
+        <w:t xml:space="preserve">3.3 Câble d'alimentation USB 5 V (paroi droite)</w:t>
       </w:r>
     </w:p>
     <w:p>
@@ -1840,7 +1840,7 @@
         </w:numPr>
       </w:pPr>
       <w:r>
-        <w:t xml:space="preserve">Poser le câble 12 V dans la fente, sur le pont, le serrer avec le collier, le visser dans J1 (+ à droite).</w:t>
+        <w:t xml:space="preserve">Poser le câble USB 5 V dans la fente, sur le pont, le serrer avec le collier, le visser dans J1 (+ à droite).</w:t>
       </w:r>
     </w:p>
     <w:p>
@@ -1885,7 +1885,7 @@
         </w:numPr>
       </w:pPr>
       <w:r>
-        <w:t xml:space="preserve">Diamètre du câble 12 V (fente de 5 mm prévue).</w:t>
+        <w:t xml:space="preserve">Diamètre du câble USB 5 V (fente de 5 mm prévue ; un câble USB courant fait 3 à 4 mm).</w:t>
       </w:r>
     </w:p>
     <w:p>

</xml_diff>